<commit_message>
R: edit nội dung file B1_rename.docx
</commit_message>
<xml_diff>
--- a/B1_rename.docx
+++ b/B1_rename.docx
@@ -8,6 +8,16 @@
       </w:pPr>
       <w:r>
         <w:t>A1</w:t>
+      </w:r>
+    </w:p>
+    <w:p>
+      <w:r>
+        <w:t xml:space="preserve"> A1.1</w:t>
+      </w:r>
+    </w:p>
+    <w:p>
+      <w:r>
+        <w:t>A1.2: Edit nội dung</w:t>
       </w:r>
     </w:p>
     <w:p>

</xml_diff>